<commit_message>
some changes in the reports
</commit_message>
<xml_diff>
--- a/HyFive.Services.Reports/Assets/FHI-five-indications-report-template.docx
+++ b/HyFive.Services.Reports/Assets/FHI-five-indications-report-template.docx
@@ -90,23 +90,7 @@
           <w:rFonts w:ascii="Roborot" w:hAnsi="Roborot"/>
           <w:sz w:val="32"/>
         </w:rPr>
-        <w:t xml:space="preserve">Report of Hand Hygiene Compliance </w:t>
-      </w:r>
-      <w:proofErr w:type="gramStart"/>
-      <w:r>
-        <w:rPr>
-          <w:rFonts w:ascii="Roborot" w:hAnsi="Roborot"/>
-          <w:sz w:val="32"/>
-        </w:rPr>
-        <w:t xml:space="preserve">   “</w:t>
-      </w:r>
-      <w:proofErr w:type="gramEnd"/>
-      <w:r>
-        <w:rPr>
-          <w:rFonts w:ascii="Roborot" w:hAnsi="Roborot"/>
-          <w:sz w:val="32"/>
-        </w:rPr>
-        <w:t>Five Indications”</w:t>
+        <w:t>Report of Hand Hygiene Compliance    “Five Indications”</w:t>
       </w:r>
     </w:p>
     <w:p>
@@ -206,7 +190,7 @@
           <w:sz w:val="16"/>
           <w:szCs w:val="16"/>
         </w:rPr>
-        <w:t>2: Aseptic                                                                            B: Before aseptic – inside the zone (2, 3+2)</w:t>
+        <w:t>2: Aseptic                                                                            B: Before aseptic (2, 3+2)</w:t>
       </w:r>
       <w:r>
         <w:rPr>
@@ -230,7 +214,7 @@
           <w:sz w:val="16"/>
           <w:szCs w:val="16"/>
         </w:rPr>
-        <w:t>3: Body fluids                                                                    C: After patient (4, 3+4)</w:t>
+        <w:t xml:space="preserve">3: Body fluids                                                                    C: </w:t>
       </w:r>
       <w:r>
         <w:rPr>
@@ -238,6 +222,22 @@
           <w:sz w:val="16"/>
           <w:szCs w:val="16"/>
         </w:rPr>
+        <w:t>After patient and body fluids</w:t>
+      </w:r>
+      <w:r>
+        <w:rPr>
+          <w:rFonts w:ascii="Roborot" w:hAnsi="Roborot"/>
+          <w:sz w:val="16"/>
+          <w:szCs w:val="16"/>
+        </w:rPr>
+        <w:t xml:space="preserve"> (4, 3+4)</w:t>
+      </w:r>
+      <w:r>
+        <w:rPr>
+          <w:rFonts w:ascii="Roborot" w:hAnsi="Roborot"/>
+          <w:sz w:val="16"/>
+          <w:szCs w:val="16"/>
+        </w:rPr>
         <w:br/>
       </w:r>
       <w:r>
@@ -262,7 +262,31 @@
           <w:sz w:val="16"/>
           <w:szCs w:val="16"/>
         </w:rPr>
-        <w:t>D: Transition between patients (4+1, 3+4+1, 3+1, 3+1+2, 4+2, 4+1+2, 3+4+1+2, 3+4+2)</w:t>
+        <w:t xml:space="preserve">D: </w:t>
+      </w:r>
+      <w:r>
+        <w:rPr>
+          <w:rFonts w:ascii="Roborot" w:hAnsi="Roborot"/>
+          <w:sz w:val="16"/>
+          <w:szCs w:val="16"/>
+        </w:rPr>
+        <w:t>Move between patients</w:t>
+      </w:r>
+      <w:r>
+        <w:rPr>
+          <w:rFonts w:ascii="Roborot" w:hAnsi="Roborot"/>
+          <w:sz w:val="16"/>
+          <w:szCs w:val="16"/>
+        </w:rPr>
+        <w:t xml:space="preserve"> </w:t>
+      </w:r>
+      <w:r>
+        <w:rPr>
+          <w:rFonts w:ascii="Roborot" w:hAnsi="Roborot"/>
+          <w:sz w:val="16"/>
+          <w:szCs w:val="16"/>
+        </w:rPr>
+        <w:t>(4+1, 3+4+1, 3+1, 3+1+2, 4+2, 4+1+2, 3+4+1+2, 3+4+2)</w:t>
       </w:r>
       <w:r>
         <w:rPr>
@@ -429,7 +453,6 @@
               <v:path gradientshapeok="t" o:connecttype="rect"/>
             </v:shapetype>
             <v:shape id="Text Box 2" o:spid="_x0000_s1026" type="#_x0000_t202" alt="Classified as ECDC NORMAL " style="position:absolute;margin-left:0;margin-top:0;width:114.45pt;height:29.15pt;z-index:251661312;visibility:visible;mso-wrap-style:none;mso-wrap-distance-left:0;mso-wrap-distance-top:0;mso-wrap-distance-right:0;mso-wrap-distance-bottom:0;mso-position-horizontal:center;mso-position-horizontal-relative:page;mso-position-vertical:bottom;mso-position-vertical-relative:page;v-text-anchor:bottom" o:gfxdata="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" filled="f" stroked="f">
-              <v:fill o:detectmouseclick="t"/>
               <v:textbox style="mso-fit-shape-to-text:t" inset="0,0,0,15pt">
                 <w:txbxContent>
                   <w:p>
@@ -560,7 +583,6 @@
               <v:path gradientshapeok="t" o:connecttype="rect"/>
             </v:shapetype>
             <v:shape id="Text Box 1" o:spid="_x0000_s1027" type="#_x0000_t202" alt="Classified as ECDC NORMAL " style="position:absolute;margin-left:0;margin-top:0;width:114.45pt;height:29.15pt;z-index:251660288;visibility:visible;mso-wrap-style:none;mso-wrap-distance-left:0;mso-wrap-distance-top:0;mso-wrap-distance-right:0;mso-wrap-distance-bottom:0;mso-position-horizontal:center;mso-position-horizontal-relative:page;mso-position-vertical:bottom;mso-position-vertical-relative:page;v-text-anchor:bottom" o:gfxdata="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" filled="f" stroked="f">
-              <v:fill o:detectmouseclick="t"/>
               <v:textbox style="mso-fit-shape-to-text:t" inset="0,0,0,15pt">
                 <w:txbxContent>
                   <w:p>
@@ -1225,7 +1247,6 @@
   <w:style w:type="character" w:default="1" w:styleId="DefaultParagraphFont">
     <w:name w:val="Default Paragraph Font"/>
     <w:uiPriority w:val="1"/>
-    <w:semiHidden/>
     <w:unhideWhenUsed/>
   </w:style>
   <w:style w:type="table" w:default="1" w:styleId="TableNormal">

</xml_diff>